<commit_message>
Remove temporary Word file
</commit_message>
<xml_diff>
--- a/module-1/Advanced Python GitHub CSD325 Peter Ddamulira.docx
+++ b/module-1/Advanced Python GitHub CSD325 Peter Ddamulira.docx
@@ -55,16 +55,7 @@
           <w:bCs/>
           <w:color w:val="000000"/>
         </w:rPr>
-        <w:t>0</w:t>
-      </w:r>
-      <w:r>
-        <w:rPr>
-          <w:rFonts w:ascii="Arial" w:eastAsia="Times New Roman" w:hAnsi="Arial" w:cs="Arial"/>
-          <w:b/>
-          <w:bCs/>
-          <w:color w:val="000000"/>
-        </w:rPr>
-        <w:t>7</w:t>
+        <w:t>07</w:t>
       </w:r>
       <w:r>
         <w:rPr>
@@ -224,6 +215,9 @@
         <w:br/>
       </w:r>
       <w:r>
+        <w:rPr>
+          <w:noProof/>
+        </w:rPr>
         <w:drawing>
           <wp:inline distT="0" distB="0" distL="0" distR="0" wp14:anchorId="6BA1874C" wp14:editId="06D6F4A5">
             <wp:extent cx="5943600" cy="2326640"/>
@@ -249,6 +243,190 @@
                     <a:xfrm>
                       <a:off x="0" y="0"/>
                       <a:ext cx="5943600" cy="2326640"/>
+                    </a:xfrm>
+                    <a:prstGeom prst="rect">
+                      <a:avLst/>
+                    </a:prstGeom>
+                  </pic:spPr>
+                </pic:pic>
+              </a:graphicData>
+            </a:graphic>
+          </wp:inline>
+        </w:drawing>
+      </w:r>
+      <w:r>
+        <w:rPr>
+          <w:rFonts w:ascii="Open Sans" w:hAnsi="Open Sans" w:cs="Open Sans"/>
+          <w:b/>
+          <w:bCs/>
+          <w:color w:val="262626"/>
+          <w:sz w:val="21"/>
+          <w:szCs w:val="21"/>
+          <w:shd w:val="clear" w:color="auto" w:fill="FFFFFF"/>
+        </w:rPr>
+        <w:br/>
+      </w:r>
+      <w:r>
+        <w:rPr>
+          <w:rFonts w:ascii="Open Sans" w:hAnsi="Open Sans" w:cs="Open Sans"/>
+          <w:b/>
+          <w:bCs/>
+          <w:color w:val="262626"/>
+          <w:sz w:val="21"/>
+          <w:szCs w:val="21"/>
+          <w:shd w:val="clear" w:color="auto" w:fill="FFFFFF"/>
+        </w:rPr>
+        <w:br/>
+      </w:r>
+      <w:r>
+        <w:drawing>
+          <wp:inline distT="0" distB="0" distL="0" distR="0" wp14:anchorId="46C13B9C" wp14:editId="458D2300">
+            <wp:extent cx="5943600" cy="3388995"/>
+            <wp:effectExtent l="0" t="0" r="0" b="1905"/>
+            <wp:docPr id="1067003463" name="Picture 1"/>
+            <wp:cNvGraphicFramePr>
+              <a:graphicFrameLocks xmlns:a="http://schemas.openxmlformats.org/drawingml/2006/main" noChangeAspect="1"/>
+            </wp:cNvGraphicFramePr>
+            <a:graphic xmlns:a="http://schemas.openxmlformats.org/drawingml/2006/main">
+              <a:graphicData uri="http://schemas.openxmlformats.org/drawingml/2006/picture">
+                <pic:pic xmlns:pic="http://schemas.openxmlformats.org/drawingml/2006/picture">
+                  <pic:nvPicPr>
+                    <pic:cNvPr id="1067003463" name=""/>
+                    <pic:cNvPicPr/>
+                  </pic:nvPicPr>
+                  <pic:blipFill>
+                    <a:blip r:embed="rId5"/>
+                    <a:stretch>
+                      <a:fillRect/>
+                    </a:stretch>
+                  </pic:blipFill>
+                  <pic:spPr>
+                    <a:xfrm>
+                      <a:off x="0" y="0"/>
+                      <a:ext cx="5943600" cy="3388995"/>
+                    </a:xfrm>
+                    <a:prstGeom prst="rect">
+                      <a:avLst/>
+                    </a:prstGeom>
+                  </pic:spPr>
+                </pic:pic>
+              </a:graphicData>
+            </a:graphic>
+          </wp:inline>
+        </w:drawing>
+      </w:r>
+      <w:r>
+        <w:rPr>
+          <w:rFonts w:ascii="Open Sans" w:hAnsi="Open Sans" w:cs="Open Sans"/>
+          <w:b/>
+          <w:bCs/>
+          <w:color w:val="262626"/>
+          <w:sz w:val="21"/>
+          <w:szCs w:val="21"/>
+          <w:shd w:val="clear" w:color="auto" w:fill="FFFFFF"/>
+        </w:rPr>
+        <w:br/>
+      </w:r>
+      <w:r>
+        <w:rPr>
+          <w:rFonts w:ascii="Open Sans" w:hAnsi="Open Sans" w:cs="Open Sans"/>
+          <w:b/>
+          <w:bCs/>
+          <w:color w:val="262626"/>
+          <w:sz w:val="21"/>
+          <w:szCs w:val="21"/>
+          <w:shd w:val="clear" w:color="auto" w:fill="FFFFFF"/>
+        </w:rPr>
+        <w:br/>
+      </w:r>
+      <w:r>
+        <w:lastRenderedPageBreak/>
+        <w:drawing>
+          <wp:inline distT="0" distB="0" distL="0" distR="0" wp14:anchorId="47117F1B" wp14:editId="26E3EC6B">
+            <wp:extent cx="5943600" cy="2458085"/>
+            <wp:effectExtent l="0" t="0" r="0" b="0"/>
+            <wp:docPr id="2029133099" name="Picture 1"/>
+            <wp:cNvGraphicFramePr>
+              <a:graphicFrameLocks xmlns:a="http://schemas.openxmlformats.org/drawingml/2006/main" noChangeAspect="1"/>
+            </wp:cNvGraphicFramePr>
+            <a:graphic xmlns:a="http://schemas.openxmlformats.org/drawingml/2006/main">
+              <a:graphicData uri="http://schemas.openxmlformats.org/drawingml/2006/picture">
+                <pic:pic xmlns:pic="http://schemas.openxmlformats.org/drawingml/2006/picture">
+                  <pic:nvPicPr>
+                    <pic:cNvPr id="2029133099" name=""/>
+                    <pic:cNvPicPr/>
+                  </pic:nvPicPr>
+                  <pic:blipFill>
+                    <a:blip r:embed="rId6"/>
+                    <a:stretch>
+                      <a:fillRect/>
+                    </a:stretch>
+                  </pic:blipFill>
+                  <pic:spPr>
+                    <a:xfrm>
+                      <a:off x="0" y="0"/>
+                      <a:ext cx="5943600" cy="2458085"/>
+                    </a:xfrm>
+                    <a:prstGeom prst="rect">
+                      <a:avLst/>
+                    </a:prstGeom>
+                  </pic:spPr>
+                </pic:pic>
+              </a:graphicData>
+            </a:graphic>
+          </wp:inline>
+        </w:drawing>
+      </w:r>
+      <w:r>
+        <w:rPr>
+          <w:rFonts w:ascii="Open Sans" w:hAnsi="Open Sans" w:cs="Open Sans"/>
+          <w:b/>
+          <w:bCs/>
+          <w:color w:val="262626"/>
+          <w:sz w:val="21"/>
+          <w:szCs w:val="21"/>
+          <w:shd w:val="clear" w:color="auto" w:fill="FFFFFF"/>
+        </w:rPr>
+        <w:br/>
+      </w:r>
+      <w:r>
+        <w:rPr>
+          <w:rFonts w:ascii="Open Sans" w:hAnsi="Open Sans" w:cs="Open Sans"/>
+          <w:b/>
+          <w:bCs/>
+          <w:color w:val="262626"/>
+          <w:sz w:val="21"/>
+          <w:szCs w:val="21"/>
+          <w:shd w:val="clear" w:color="auto" w:fill="FFFFFF"/>
+        </w:rPr>
+        <w:br/>
+      </w:r>
+      <w:r>
+        <w:drawing>
+          <wp:inline distT="0" distB="0" distL="0" distR="0" wp14:anchorId="4CEB3C98" wp14:editId="2A107614">
+            <wp:extent cx="5943600" cy="3350895"/>
+            <wp:effectExtent l="0" t="0" r="0" b="1905"/>
+            <wp:docPr id="279228570" name="Picture 1"/>
+            <wp:cNvGraphicFramePr>
+              <a:graphicFrameLocks xmlns:a="http://schemas.openxmlformats.org/drawingml/2006/main" noChangeAspect="1"/>
+            </wp:cNvGraphicFramePr>
+            <a:graphic xmlns:a="http://schemas.openxmlformats.org/drawingml/2006/main">
+              <a:graphicData uri="http://schemas.openxmlformats.org/drawingml/2006/picture">
+                <pic:pic xmlns:pic="http://schemas.openxmlformats.org/drawingml/2006/picture">
+                  <pic:nvPicPr>
+                    <pic:cNvPr id="279228570" name=""/>
+                    <pic:cNvPicPr/>
+                  </pic:nvPicPr>
+                  <pic:blipFill>
+                    <a:blip r:embed="rId7"/>
+                    <a:stretch>
+                      <a:fillRect/>
+                    </a:stretch>
+                  </pic:blipFill>
+                  <pic:spPr>
+                    <a:xfrm>
+                      <a:off x="0" y="0"/>
+                      <a:ext cx="5943600" cy="3350895"/>
                     </a:xfrm>
                     <a:prstGeom prst="rect">
                       <a:avLst/>
@@ -874,6 +1052,7 @@
   <w:style w:type="character" w:default="1" w:styleId="DefaultParagraphFont">
     <w:name w:val="Default Paragraph Font"/>
     <w:uiPriority w:val="1"/>
+    <w:semiHidden/>
     <w:unhideWhenUsed/>
   </w:style>
   <w:style w:type="table" w:default="1" w:styleId="TableNormal">

</xml_diff>